<commit_message>
Fix(parsers): simplify ocr tests
</commit_message>
<xml_diff>
--- a/parser/assets/text_tables_png.docx
+++ b/parser/assets/text_tables_png.docx
@@ -1,75 +1,40 @@
 
 <file path=word/document.xml><?xml version="1.0" encoding="utf-8"?>
-<w:document xmlns:wpc="http://schemas.microsoft.com/office/word/2010/wordprocessingCanvas" xmlns:mc="http://schemas.openxmlformats.org/markup-compatibility/2006" xmlns:o="urn:schemas-microsoft-com:office:office" xmlns:r="http://schemas.openxmlformats.org/officeDocument/2006/relationships" xmlns:m="http://schemas.openxmlformats.org/officeDocument/2006/math" xmlns:v="urn:schemas-microsoft-com:vml" xmlns:wp14="http://schemas.microsoft.com/office/word/2010/wordprocessingDrawing" xmlns:wp="http://schemas.openxmlformats.org/drawingml/2006/wordprocessingDrawing" xmlns:w10="urn:schemas-microsoft-com:office:word" xmlns:w="http://schemas.openxmlformats.org/wordprocessingml/2006/main" xmlns:w14="http://schemas.microsoft.com/office/word/2010/wordml" xmlns:w15="http://schemas.microsoft.com/office/word/2012/wordml" xmlns:wpg="http://schemas.microsoft.com/office/word/2010/wordprocessingGroup" xmlns:wpi="http://schemas.microsoft.com/office/word/2010/wordprocessingInk" xmlns:wne="http://schemas.microsoft.com/office/word/2006/wordml" xmlns:wps="http://schemas.microsoft.com/office/word/2010/wordprocessingShape" xmlns:w16se="http://schemas.microsoft.com/office/word/2015/wordml/symex" xmlns:w16cid="http://schemas.microsoft.com/office/word/2016/wordml/cid" xmlns:w16="http://schemas.microsoft.com/office/word/2018/wordml" xmlns:w16cex="http://schemas.microsoft.com/office/word/2018/wordml/cex" xmlns:w16sdtdh="http://schemas.microsoft.com/office/word/2020/wordml/sdtdatahash" xmlns:w16sdtfl="http://schemas.microsoft.com/office/word/2024/wordml/sdtformatlock" xmlns:a="http://schemas.openxmlformats.org/drawingml/2006/main" xmlns:pic="http://schemas.openxmlformats.org/drawingml/2006/picture" xmlns:a14="http://schemas.microsoft.com/office/drawing/2010/main" mc:Ignorable="w14 w15 wp14 w16se w16cid w16 w16cex w16sdtdh w16sdtfl">
+<w:document xmlns:o="urn:schemas-microsoft-com:office:office" xmlns:r="http://schemas.openxmlformats.org/officeDocument/2006/relationships" xmlns:v="urn:schemas-microsoft-com:vml" xmlns:w="http://schemas.openxmlformats.org/wordprocessingml/2006/main" xmlns:w10="urn:schemas-microsoft-com:office:word" xmlns:wp="http://schemas.openxmlformats.org/drawingml/2006/wordprocessingDrawing" xmlns:pic="http://schemas.openxmlformats.org/drawingml/2006/picture" xmlns:wps="http://schemas.microsoft.com/office/word/2010/wordprocessingShape" xmlns:wpg="http://schemas.microsoft.com/office/word/2010/wordprocessingGroup" xmlns:mc="http://schemas.openxmlformats.org/markup-compatibility/2006" xmlns:wp14="http://schemas.microsoft.com/office/word/2010/wordprocessingDrawing" xmlns:w14="http://schemas.microsoft.com/office/word/2010/wordml" xmlns:w15="http://schemas.microsoft.com/office/word/2012/wordml" mc:Ignorable="w14 wp14 w15">
   <w:body>
-    <w:p xmlns:wp14="http://schemas.microsoft.com/office/word/2010/wordml" wp14:paraId="501817AE" wp14:textId="56F2C508">
+    <w:p>
+      <w:pPr>
+        <w:pStyle w:val="Normal"/>
+        <w:rPr/>
+      </w:pPr>
       <w:r>
         <w:rPr/>
-        <w:t>Some</w:t>
-      </w:r>
-      <w:r>
-        <w:rPr/>
-        <w:t xml:space="preserve"> </w:t>
-      </w:r>
-      <w:r>
-        <w:rPr/>
-        <w:t>text</w:t>
-      </w:r>
-      <w:r>
-        <w:rPr/>
-        <w:t xml:space="preserve"> </w:t>
-      </w:r>
-      <w:r>
+        <w:t xml:space="preserve">Some text </w:t>
         <w:br/>
-      </w:r>
-      <w:r>
         <w:br/>
-      </w:r>
-      <w:r>
         <w:br/>
-      </w:r>
-      <w:r>
-        <w:rPr/>
-        <w:t xml:space="preserve">Параграф 1. какой-то текст, </w:t>
-      </w:r>
-      <w:r>
-        <w:rPr/>
-        <w:t>тра</w:t>
-      </w:r>
-      <w:r>
-        <w:rPr/>
-        <w:t xml:space="preserve"> ля </w:t>
-      </w:r>
-      <w:r>
-        <w:rPr/>
-        <w:t>ля</w:t>
-      </w:r>
-      <w:r>
-        <w:rPr/>
-        <w:t>.                           много пробелов                          пум пум</w:t>
-      </w:r>
-      <w:r>
+        <w:t>Параграф 1. какой-то текст, тра ля ля.                           много пробелов                          пум пум</w:t>
         <w:br/>
-      </w:r>
-      <w:r>
         <w:br/>
-      </w:r>
-      <w:r>
         <w:br/>
-      </w:r>
-      <w:r>
         <w:br/>
-      </w:r>
-      <w:r>
-        <w:rPr/>
         <w:t>Таблица (3x3)</w:t>
       </w:r>
     </w:p>
     <w:tbl>
       <w:tblPr>
         <w:tblStyle w:val="TableGrid"/>
-        <w:tblW w:w="0" w:type="auto"/>
-        <w:tblLook w:val="06A0" w:firstRow="1" w:lastRow="0" w:firstColumn="1" w:lastColumn="0" w:noHBand="1" w:noVBand="1"/>
+        <w:tblW w:w="9015" w:type="dxa"/>
+        <w:jc w:val="start"/>
+        <w:tblInd w:w="0" w:type="dxa"/>
+        <w:tblLayout w:type="fixed"/>
+        <w:tblCellMar>
+          <w:top w:w="0" w:type="dxa"/>
+          <w:start w:w="108" w:type="dxa"/>
+          <w:bottom w:w="0" w:type="dxa"/>
+          <w:end w:w="108" w:type="dxa"/>
+        </w:tblCellMar>
+        <w:tblLook w:val="06a0" w:noHBand="1" w:noVBand="1" w:firstColumn="1" w:lastRow="0" w:lastColumn="0" w:firstRow="1"/>
       </w:tblPr>
       <w:tblGrid>
         <w:gridCol w:w="3005"/>
@@ -78,27 +43,53 @@
       </w:tblGrid>
       <w:tr>
         <w:trPr>
-          <w:trHeight w:val="300"/>
+          <w:trHeight w:val="300" w:hRule="atLeast"/>
         </w:trPr>
         <w:tc>
           <w:tcPr>
             <w:tcW w:w="3005" w:type="dxa"/>
-            <w:tcMar/>
+            <w:tcBorders/>
           </w:tcPr>
           <w:p>
             <w:pPr>
               <w:pStyle w:val="Normal"/>
+              <w:widowControl/>
+              <w:suppressAutoHyphens w:val="true"/>
+              <w:spacing w:lineRule="auto" w:line="240" w:before="0" w:after="0"/>
+              <w:jc w:val="start"/>
+              <w:rPr>
+                <w:rFonts w:ascii="Aptos" w:hAnsi="Aptos" w:eastAsia="Aptos" w:cs=""/>
+                <w:kern w:val="0"/>
+                <w:sz w:val="24"/>
+                <w:szCs w:val="24"/>
+                <w:lang w:val="ru-RU" w:eastAsia="en-US" w:bidi="ar-SA"/>
+              </w:rPr>
             </w:pPr>
             <w:r>
-              <w:rPr/>
+              <w:rPr>
+                <w:rFonts w:eastAsia="Aptos" w:cs=""/>
+                <w:kern w:val="0"/>
+                <w:sz w:val="24"/>
+                <w:szCs w:val="24"/>
+                <w:lang w:val="ru-RU" w:eastAsia="en-US" w:bidi="ar-SA"/>
+              </w:rPr>
               <w:t>A11 (в ней же таблица)</w:t>
             </w:r>
           </w:p>
           <w:tbl>
             <w:tblPr>
               <w:tblStyle w:val="TableGrid"/>
-              <w:tblW w:w="0" w:type="auto"/>
-              <w:tblLook w:val="06A0" w:firstRow="1" w:lastRow="0" w:firstColumn="1" w:lastColumn="0" w:noHBand="1" w:noVBand="1"/>
+              <w:tblW w:w="2790" w:type="dxa"/>
+              <w:jc w:val="start"/>
+              <w:tblInd w:w="0" w:type="dxa"/>
+              <w:tblLayout w:type="fixed"/>
+              <w:tblCellMar>
+                <w:top w:w="0" w:type="dxa"/>
+                <w:start w:w="108" w:type="dxa"/>
+                <w:bottom w:w="0" w:type="dxa"/>
+                <w:end w:w="108" w:type="dxa"/>
+              </w:tblCellMar>
+              <w:tblLook w:val="06a0" w:noHBand="1" w:noVBand="1" w:firstColumn="1" w:lastRow="0" w:lastColumn="0" w:firstRow="1"/>
             </w:tblPr>
             <w:tblGrid>
               <w:gridCol w:w="1395"/>
@@ -106,19 +97,36 @@
             </w:tblGrid>
             <w:tr>
               <w:trPr>
-                <w:trHeight w:val="300"/>
+                <w:trHeight w:val="300" w:hRule="atLeast"/>
               </w:trPr>
               <w:tc>
                 <w:tcPr>
                   <w:tcW w:w="1395" w:type="dxa"/>
-                  <w:tcMar/>
+                  <w:tcBorders/>
                 </w:tcPr>
                 <w:p>
                   <w:pPr>
                     <w:pStyle w:val="Normal"/>
+                    <w:widowControl/>
+                    <w:suppressAutoHyphens w:val="true"/>
+                    <w:spacing w:lineRule="auto" w:line="240" w:before="0" w:after="0"/>
+                    <w:jc w:val="start"/>
+                    <w:rPr>
+                      <w:rFonts w:ascii="Aptos" w:hAnsi="Aptos" w:eastAsia="Aptos" w:cs=""/>
+                      <w:kern w:val="0"/>
+                      <w:sz w:val="24"/>
+                      <w:szCs w:val="24"/>
+                      <w:lang w:val="ru-RU" w:eastAsia="en-US" w:bidi="ar-SA"/>
+                    </w:rPr>
                   </w:pPr>
                   <w:r>
-                    <w:rPr/>
+                    <w:rPr>
+                      <w:rFonts w:eastAsia="Aptos" w:cs=""/>
+                      <w:kern w:val="0"/>
+                      <w:sz w:val="24"/>
+                      <w:szCs w:val="24"/>
+                      <w:lang w:val="ru-RU" w:eastAsia="en-US" w:bidi="ar-SA"/>
+                    </w:rPr>
                     <w:t>A11_11</w:t>
                   </w:r>
                 </w:p>
@@ -126,14 +134,31 @@
               <w:tc>
                 <w:tcPr>
                   <w:tcW w:w="1395" w:type="dxa"/>
-                  <w:tcMar/>
+                  <w:tcBorders/>
                 </w:tcPr>
                 <w:p>
                   <w:pPr>
                     <w:pStyle w:val="Normal"/>
+                    <w:widowControl/>
+                    <w:suppressAutoHyphens w:val="true"/>
+                    <w:spacing w:lineRule="auto" w:line="240" w:before="0" w:after="0"/>
+                    <w:jc w:val="start"/>
+                    <w:rPr>
+                      <w:rFonts w:ascii="Aptos" w:hAnsi="Aptos" w:eastAsia="Aptos" w:cs=""/>
+                      <w:kern w:val="0"/>
+                      <w:sz w:val="24"/>
+                      <w:szCs w:val="24"/>
+                      <w:lang w:val="ru-RU" w:eastAsia="en-US" w:bidi="ar-SA"/>
+                    </w:rPr>
                   </w:pPr>
                   <w:r>
-                    <w:rPr/>
+                    <w:rPr>
+                      <w:rFonts w:eastAsia="Aptos" w:cs=""/>
+                      <w:kern w:val="0"/>
+                      <w:sz w:val="24"/>
+                      <w:szCs w:val="24"/>
+                      <w:lang w:val="ru-RU" w:eastAsia="en-US" w:bidi="ar-SA"/>
+                    </w:rPr>
                     <w:t>A11_12</w:t>
                   </w:r>
                 </w:p>
@@ -141,19 +166,36 @@
             </w:tr>
             <w:tr>
               <w:trPr>
-                <w:trHeight w:val="300"/>
+                <w:trHeight w:val="300" w:hRule="atLeast"/>
               </w:trPr>
               <w:tc>
                 <w:tcPr>
                   <w:tcW w:w="1395" w:type="dxa"/>
-                  <w:tcMar/>
+                  <w:tcBorders/>
                 </w:tcPr>
                 <w:p>
                   <w:pPr>
                     <w:pStyle w:val="Normal"/>
+                    <w:widowControl/>
+                    <w:suppressAutoHyphens w:val="true"/>
+                    <w:spacing w:lineRule="auto" w:line="240" w:before="0" w:after="0"/>
+                    <w:jc w:val="start"/>
+                    <w:rPr>
+                      <w:rFonts w:ascii="Aptos" w:hAnsi="Aptos" w:eastAsia="Aptos" w:cs=""/>
+                      <w:kern w:val="0"/>
+                      <w:sz w:val="24"/>
+                      <w:szCs w:val="24"/>
+                      <w:lang w:val="ru-RU" w:eastAsia="en-US" w:bidi="ar-SA"/>
+                    </w:rPr>
                   </w:pPr>
                   <w:r>
-                    <w:rPr/>
+                    <w:rPr>
+                      <w:rFonts w:eastAsia="Aptos" w:cs=""/>
+                      <w:kern w:val="0"/>
+                      <w:sz w:val="24"/>
+                      <w:szCs w:val="24"/>
+                      <w:lang w:val="ru-RU" w:eastAsia="en-US" w:bidi="ar-SA"/>
+                    </w:rPr>
                     <w:t>A11_21</w:t>
                   </w:r>
                 </w:p>
@@ -161,14 +203,31 @@
               <w:tc>
                 <w:tcPr>
                   <w:tcW w:w="1395" w:type="dxa"/>
-                  <w:tcMar/>
+                  <w:tcBorders/>
                 </w:tcPr>
                 <w:p>
                   <w:pPr>
                     <w:pStyle w:val="Normal"/>
+                    <w:widowControl/>
+                    <w:suppressAutoHyphens w:val="true"/>
+                    <w:spacing w:lineRule="auto" w:line="240" w:before="0" w:after="0"/>
+                    <w:jc w:val="start"/>
+                    <w:rPr>
+                      <w:rFonts w:ascii="Aptos" w:hAnsi="Aptos" w:eastAsia="Aptos" w:cs=""/>
+                      <w:kern w:val="0"/>
+                      <w:sz w:val="24"/>
+                      <w:szCs w:val="24"/>
+                      <w:lang w:val="ru-RU" w:eastAsia="en-US" w:bidi="ar-SA"/>
+                    </w:rPr>
                   </w:pPr>
                   <w:r>
-                    <w:rPr/>
+                    <w:rPr>
+                      <w:rFonts w:eastAsia="Aptos" w:cs=""/>
+                      <w:kern w:val="0"/>
+                      <w:sz w:val="24"/>
+                      <w:szCs w:val="24"/>
+                      <w:lang w:val="ru-RU" w:eastAsia="en-US" w:bidi="ar-SA"/>
+                    </w:rPr>
                     <w:t>A11_22</w:t>
                   </w:r>
                 </w:p>
@@ -178,20 +237,57 @@
           <w:p>
             <w:pPr>
               <w:pStyle w:val="Normal"/>
+              <w:widowControl/>
+              <w:suppressAutoHyphens w:val="true"/>
+              <w:spacing w:lineRule="auto" w:line="240" w:before="0" w:after="0"/>
+              <w:jc w:val="start"/>
+              <w:rPr>
+                <w:rFonts w:ascii="Aptos" w:hAnsi="Aptos" w:eastAsia="Aptos" w:cs=""/>
+                <w:kern w:val="0"/>
+                <w:sz w:val="24"/>
+                <w:szCs w:val="24"/>
+                <w:lang w:val="ru-RU" w:eastAsia="en-US" w:bidi="ar-SA"/>
+              </w:rPr>
             </w:pPr>
+            <w:r>
+              <w:rPr>
+                <w:rFonts w:eastAsia="Aptos" w:cs=""/>
+                <w:kern w:val="0"/>
+                <w:sz w:val="24"/>
+                <w:szCs w:val="24"/>
+                <w:lang w:val="ru-RU" w:eastAsia="en-US" w:bidi="ar-SA"/>
+              </w:rPr>
+            </w:r>
           </w:p>
         </w:tc>
         <w:tc>
           <w:tcPr>
             <w:tcW w:w="3005" w:type="dxa"/>
-            <w:tcMar/>
+            <w:tcBorders/>
           </w:tcPr>
           <w:p>
             <w:pPr>
               <w:pStyle w:val="Normal"/>
+              <w:widowControl/>
+              <w:suppressAutoHyphens w:val="true"/>
+              <w:spacing w:lineRule="auto" w:line="240" w:before="0" w:after="0"/>
+              <w:jc w:val="start"/>
+              <w:rPr>
+                <w:rFonts w:ascii="Aptos" w:hAnsi="Aptos" w:eastAsia="Aptos" w:cs=""/>
+                <w:kern w:val="0"/>
+                <w:sz w:val="24"/>
+                <w:szCs w:val="24"/>
+                <w:lang w:val="ru-RU" w:eastAsia="en-US" w:bidi="ar-SA"/>
+              </w:rPr>
             </w:pPr>
             <w:r>
-              <w:rPr/>
+              <w:rPr>
+                <w:rFonts w:eastAsia="Aptos" w:cs=""/>
+                <w:kern w:val="0"/>
+                <w:sz w:val="24"/>
+                <w:szCs w:val="24"/>
+                <w:lang w:val="ru-RU" w:eastAsia="en-US" w:bidi="ar-SA"/>
+              </w:rPr>
               <w:t>a12</w:t>
             </w:r>
           </w:p>
@@ -199,14 +295,31 @@
         <w:tc>
           <w:tcPr>
             <w:tcW w:w="3005" w:type="dxa"/>
-            <w:tcMar/>
+            <w:tcBorders/>
           </w:tcPr>
           <w:p>
             <w:pPr>
               <w:pStyle w:val="Normal"/>
+              <w:widowControl/>
+              <w:suppressAutoHyphens w:val="true"/>
+              <w:spacing w:lineRule="auto" w:line="240" w:before="0" w:after="0"/>
+              <w:jc w:val="start"/>
+              <w:rPr>
+                <w:rFonts w:ascii="Aptos" w:hAnsi="Aptos" w:eastAsia="Aptos" w:cs=""/>
+                <w:kern w:val="0"/>
+                <w:sz w:val="24"/>
+                <w:szCs w:val="24"/>
+                <w:lang w:val="ru-RU" w:eastAsia="en-US" w:bidi="ar-SA"/>
+              </w:rPr>
             </w:pPr>
             <w:r>
-              <w:rPr/>
+              <w:rPr>
+                <w:rFonts w:eastAsia="Aptos" w:cs=""/>
+                <w:kern w:val="0"/>
+                <w:sz w:val="24"/>
+                <w:szCs w:val="24"/>
+                <w:lang w:val="ru-RU" w:eastAsia="en-US" w:bidi="ar-SA"/>
+              </w:rPr>
               <w:t>a13</w:t>
             </w:r>
           </w:p>
@@ -214,19 +327,36 @@
       </w:tr>
       <w:tr>
         <w:trPr>
-          <w:trHeight w:val="300"/>
+          <w:trHeight w:val="300" w:hRule="atLeast"/>
         </w:trPr>
         <w:tc>
           <w:tcPr>
             <w:tcW w:w="3005" w:type="dxa"/>
-            <w:tcMar/>
+            <w:tcBorders/>
           </w:tcPr>
           <w:p>
             <w:pPr>
               <w:pStyle w:val="Normal"/>
+              <w:widowControl/>
+              <w:suppressAutoHyphens w:val="true"/>
+              <w:spacing w:lineRule="auto" w:line="240" w:before="0" w:after="0"/>
+              <w:jc w:val="start"/>
+              <w:rPr>
+                <w:rFonts w:ascii="Aptos" w:hAnsi="Aptos" w:eastAsia="Aptos" w:cs=""/>
+                <w:kern w:val="0"/>
+                <w:sz w:val="24"/>
+                <w:szCs w:val="24"/>
+                <w:lang w:val="ru-RU" w:eastAsia="en-US" w:bidi="ar-SA"/>
+              </w:rPr>
             </w:pPr>
             <w:r>
-              <w:rPr/>
+              <w:rPr>
+                <w:rFonts w:eastAsia="Aptos" w:cs=""/>
+                <w:kern w:val="0"/>
+                <w:sz w:val="24"/>
+                <w:szCs w:val="24"/>
+                <w:lang w:val="ru-RU" w:eastAsia="en-US" w:bidi="ar-SA"/>
+              </w:rPr>
               <w:t>a21</w:t>
             </w:r>
           </w:p>
@@ -234,14 +364,31 @@
         <w:tc>
           <w:tcPr>
             <w:tcW w:w="3005" w:type="dxa"/>
-            <w:tcMar/>
+            <w:tcBorders/>
           </w:tcPr>
           <w:p>
             <w:pPr>
               <w:pStyle w:val="Normal"/>
+              <w:widowControl/>
+              <w:suppressAutoHyphens w:val="true"/>
+              <w:spacing w:lineRule="auto" w:line="240" w:before="0" w:after="0"/>
+              <w:jc w:val="start"/>
+              <w:rPr>
+                <w:rFonts w:ascii="Aptos" w:hAnsi="Aptos" w:eastAsia="Aptos" w:cs=""/>
+                <w:kern w:val="0"/>
+                <w:sz w:val="24"/>
+                <w:szCs w:val="24"/>
+                <w:lang w:val="ru-RU" w:eastAsia="en-US" w:bidi="ar-SA"/>
+              </w:rPr>
             </w:pPr>
             <w:r>
-              <w:rPr/>
+              <w:rPr>
+                <w:rFonts w:eastAsia="Aptos" w:cs=""/>
+                <w:kern w:val="0"/>
+                <w:sz w:val="24"/>
+                <w:szCs w:val="24"/>
+                <w:lang w:val="ru-RU" w:eastAsia="en-US" w:bidi="ar-SA"/>
+              </w:rPr>
               <w:t>a23</w:t>
             </w:r>
           </w:p>
@@ -249,14 +396,31 @@
         <w:tc>
           <w:tcPr>
             <w:tcW w:w="3005" w:type="dxa"/>
-            <w:tcMar/>
+            <w:tcBorders/>
           </w:tcPr>
           <w:p>
             <w:pPr>
               <w:pStyle w:val="Normal"/>
+              <w:widowControl/>
+              <w:suppressAutoHyphens w:val="true"/>
+              <w:spacing w:lineRule="auto" w:line="240" w:before="0" w:after="0"/>
+              <w:jc w:val="start"/>
+              <w:rPr>
+                <w:rFonts w:ascii="Aptos" w:hAnsi="Aptos" w:eastAsia="Aptos" w:cs=""/>
+                <w:kern w:val="0"/>
+                <w:sz w:val="24"/>
+                <w:szCs w:val="24"/>
+                <w:lang w:val="ru-RU" w:eastAsia="en-US" w:bidi="ar-SA"/>
+              </w:rPr>
             </w:pPr>
             <w:r>
-              <w:rPr/>
+              <w:rPr>
+                <w:rFonts w:eastAsia="Aptos" w:cs=""/>
+                <w:kern w:val="0"/>
+                <w:sz w:val="24"/>
+                <w:szCs w:val="24"/>
+                <w:lang w:val="ru-RU" w:eastAsia="en-US" w:bidi="ar-SA"/>
+              </w:rPr>
               <w:t>a23</w:t>
             </w:r>
           </w:p>
@@ -264,19 +428,36 @@
       </w:tr>
       <w:tr>
         <w:trPr>
-          <w:trHeight w:val="300"/>
+          <w:trHeight w:val="300" w:hRule="atLeast"/>
         </w:trPr>
         <w:tc>
           <w:tcPr>
             <w:tcW w:w="3005" w:type="dxa"/>
-            <w:tcMar/>
+            <w:tcBorders/>
           </w:tcPr>
           <w:p>
             <w:pPr>
               <w:pStyle w:val="Normal"/>
+              <w:widowControl/>
+              <w:suppressAutoHyphens w:val="true"/>
+              <w:spacing w:lineRule="auto" w:line="240" w:before="0" w:after="0"/>
+              <w:jc w:val="start"/>
+              <w:rPr>
+                <w:rFonts w:ascii="Aptos" w:hAnsi="Aptos" w:eastAsia="Aptos" w:cs=""/>
+                <w:kern w:val="0"/>
+                <w:sz w:val="24"/>
+                <w:szCs w:val="24"/>
+                <w:lang w:val="ru-RU" w:eastAsia="en-US" w:bidi="ar-SA"/>
+              </w:rPr>
             </w:pPr>
             <w:r>
-              <w:rPr/>
+              <w:rPr>
+                <w:rFonts w:eastAsia="Aptos" w:cs=""/>
+                <w:kern w:val="0"/>
+                <w:sz w:val="24"/>
+                <w:szCs w:val="24"/>
+                <w:lang w:val="ru-RU" w:eastAsia="en-US" w:bidi="ar-SA"/>
+              </w:rPr>
               <w:t>a31</w:t>
             </w:r>
           </w:p>
@@ -284,14 +465,31 @@
         <w:tc>
           <w:tcPr>
             <w:tcW w:w="3005" w:type="dxa"/>
-            <w:tcMar/>
+            <w:tcBorders/>
           </w:tcPr>
           <w:p>
             <w:pPr>
               <w:pStyle w:val="Normal"/>
+              <w:widowControl/>
+              <w:suppressAutoHyphens w:val="true"/>
+              <w:spacing w:lineRule="auto" w:line="240" w:before="0" w:after="0"/>
+              <w:jc w:val="start"/>
+              <w:rPr>
+                <w:rFonts w:ascii="Aptos" w:hAnsi="Aptos" w:eastAsia="Aptos" w:cs=""/>
+                <w:kern w:val="0"/>
+                <w:sz w:val="24"/>
+                <w:szCs w:val="24"/>
+                <w:lang w:val="ru-RU" w:eastAsia="en-US" w:bidi="ar-SA"/>
+              </w:rPr>
             </w:pPr>
             <w:r>
-              <w:rPr/>
+              <w:rPr>
+                <w:rFonts w:eastAsia="Aptos" w:cs=""/>
+                <w:kern w:val="0"/>
+                <w:sz w:val="24"/>
+                <w:szCs w:val="24"/>
+                <w:lang w:val="ru-RU" w:eastAsia="en-US" w:bidi="ar-SA"/>
+              </w:rPr>
               <w:t>a32</w:t>
             </w:r>
           </w:p>
@@ -299,85 +497,122 @@
         <w:tc>
           <w:tcPr>
             <w:tcW w:w="3005" w:type="dxa"/>
-            <w:tcMar/>
+            <w:tcBorders/>
           </w:tcPr>
           <w:p>
             <w:pPr>
               <w:pStyle w:val="Normal"/>
+              <w:widowControl/>
+              <w:suppressAutoHyphens w:val="true"/>
+              <w:spacing w:lineRule="auto" w:line="240" w:before="0" w:after="0"/>
+              <w:jc w:val="start"/>
+              <w:rPr>
+                <w:rFonts w:ascii="Aptos" w:hAnsi="Aptos" w:eastAsia="Aptos" w:cs=""/>
+                <w:kern w:val="0"/>
+                <w:sz w:val="24"/>
+                <w:szCs w:val="24"/>
+                <w:lang w:val="ru-RU" w:eastAsia="en-US" w:bidi="ar-SA"/>
+              </w:rPr>
             </w:pPr>
             <w:r>
-              <w:rPr/>
+              <w:rPr>
+                <w:rFonts w:eastAsia="Aptos" w:cs=""/>
+                <w:kern w:val="0"/>
+                <w:sz w:val="24"/>
+                <w:szCs w:val="24"/>
+                <w:lang w:val="ru-RU" w:eastAsia="en-US" w:bidi="ar-SA"/>
+              </w:rPr>
               <w:t>a33</w:t>
             </w:r>
           </w:p>
         </w:tc>
       </w:tr>
     </w:tbl>
-    <w:p/>
     <w:p>
       <w:pPr>
         <w:pStyle w:val="Normal"/>
+        <w:spacing w:before="0" w:after="160"/>
+        <w:rPr/>
       </w:pPr>
       <w:r>
+        <w:rPr/>
+      </w:r>
+    </w:p>
+    <w:p>
+      <w:pPr>
+        <w:pStyle w:val="Normal"/>
+        <w:spacing w:before="0" w:after="160"/>
+        <w:rPr/>
+      </w:pPr>
+      <w:r>
+        <w:rPr/>
         <w:drawing>
-          <wp:inline wp14:editId="7FFDA858" wp14:anchorId="2CD59F4F">
-            <wp:extent cx="6087138" cy="10009532"/>
+          <wp:anchor distT="0" distB="0" distL="0" distR="0" simplePos="0" relativeHeight="2" behindDoc="0" locked="0" layoutInCell="0" allowOverlap="1">
+            <wp:simplePos x="0" y="0"/>
+            <wp:positionH relativeFrom="column">
+              <wp:posOffset>2261235</wp:posOffset>
+            </wp:positionH>
+            <wp:positionV relativeFrom="paragraph">
+              <wp:posOffset>9525</wp:posOffset>
+            </wp:positionV>
+            <wp:extent cx="904875" cy="200025"/>
             <wp:effectExtent l="0" t="0" r="0" b="0"/>
-            <wp:docPr id="1869794548" name="drawing"/>
+            <wp:wrapSquare wrapText="largest"/>
+            <wp:docPr id="1" name="Image2"/>
             <wp:cNvGraphicFramePr>
-              <a:graphicFrameLocks noChangeAspect="1"/>
+              <a:graphicFrameLocks xmlns:a="http://schemas.openxmlformats.org/drawingml/2006/main" noChangeAspect="1"/>
             </wp:cNvGraphicFramePr>
-            <a:graphic>
-              <a:graphicData xmlns:a="http://schemas.openxmlformats.org/drawingml/2006/main" uri="http://schemas.openxmlformats.org/drawingml/2006/picture">
+            <a:graphic xmlns:a="http://schemas.openxmlformats.org/drawingml/2006/main">
+              <a:graphicData uri="http://schemas.openxmlformats.org/drawingml/2006/picture">
                 <pic:pic xmlns:pic="http://schemas.openxmlformats.org/drawingml/2006/picture">
                   <pic:nvPicPr>
-                    <pic:cNvPr id="1869794548" name="Picture 1869794548"/>
-                    <pic:cNvPicPr/>
+                    <pic:cNvPr id="1" name="Image2"/>
+                    <pic:cNvPicPr>
+                      <a:picLocks noChangeAspect="1" noChangeArrowheads="1"/>
+                    </pic:cNvPicPr>
                   </pic:nvPicPr>
                   <pic:blipFill>
-                    <a:blip xmlns:r="http://schemas.openxmlformats.org/officeDocument/2006/relationships" r:embed="rId663977569">
-                      <a:extLst>
-                        <a:ext uri="{28A0092B-C50C-407E-A947-70E740481C1C}">
-                          <a14:useLocalDpi xmlns:a14="http://schemas.microsoft.com/office/drawing/2010/main"/>
-                        </a:ext>
-                      </a:extLst>
-                    </a:blip>
+                    <a:blip r:embed="rId2"/>
                     <a:stretch>
                       <a:fillRect/>
                     </a:stretch>
                   </pic:blipFill>
-                  <pic:spPr>
-                    <a:xfrm rot="0">
+                  <pic:spPr bwMode="auto">
+                    <a:xfrm>
                       <a:off x="0" y="0"/>
-                      <a:ext cx="6087138" cy="10009532"/>
+                      <a:ext cx="904875" cy="200025"/>
                     </a:xfrm>
                     <a:prstGeom prst="rect">
                       <a:avLst/>
                     </a:prstGeom>
+                    <a:noFill/>
                   </pic:spPr>
                 </pic:pic>
               </a:graphicData>
             </a:graphic>
-          </wp:inline>
+          </wp:anchor>
         </w:drawing>
       </w:r>
     </w:p>
     <w:sectPr>
-      <w:pgSz w:w="11906" w:h="16838" w:orient="portrait"/>
-      <w:pgMar w:top="1440" w:right="1440" w:bottom="1440" w:left="1440" w:header="720" w:footer="720" w:gutter="0"/>
-      <w:cols w:space="720"/>
-      <w:docGrid w:linePitch="360"/>
+      <w:type w:val="nextPage"/>
+      <w:pgSz w:w="11906" w:h="16838"/>
+      <w:pgMar w:left="1440" w:right="1440" w:gutter="0" w:header="0" w:top="1440" w:footer="0" w:bottom="1440"/>
+      <w:pgNumType w:fmt="decimal"/>
+      <w:formProt w:val="false"/>
+      <w:textDirection w:val="lrTb"/>
+      <w:docGrid w:type="default" w:linePitch="360" w:charSpace="0"/>
     </w:sectPr>
   </w:body>
 </w:document>
 </file>
 
 <file path=word/styles.xml><?xml version="1.0" encoding="utf-8"?>
-<w:styles xmlns:wp14="http://schemas.microsoft.com/office/word/2010/wordprocessingDrawing" xmlns:mc="http://schemas.openxmlformats.org/markup-compatibility/2006" xmlns:r="http://schemas.openxmlformats.org/officeDocument/2006/relationships" xmlns:w="http://schemas.openxmlformats.org/wordprocessingml/2006/main" xmlns:w14="http://schemas.microsoft.com/office/word/2010/wordml" xmlns:w15="http://schemas.microsoft.com/office/word/2012/wordml" xmlns:w16se="http://schemas.microsoft.com/office/word/2015/wordml/symex" xmlns:w16cid="http://schemas.microsoft.com/office/word/2016/wordml/cid" xmlns:w16="http://schemas.microsoft.com/office/word/2018/wordml" xmlns:w16cex="http://schemas.microsoft.com/office/word/2018/wordml/cex" xmlns:w16sdtdh="http://schemas.microsoft.com/office/word/2020/wordml/sdtdatahash" xmlns:w16sdtfl="http://schemas.microsoft.com/office/word/2024/wordml/sdtformatlock" mc:Ignorable="w14 w15 wp14 w16se w16cid w16 w16cex w16sdtdh w16sdtfl">
+<w:styles xmlns:w="http://schemas.openxmlformats.org/wordprocessingml/2006/main" xmlns:w14="http://schemas.microsoft.com/office/word/2010/wordml" xmlns:mc="http://schemas.openxmlformats.org/markup-compatibility/2006" mc:Ignorable="w14">
   <w:docDefaults>
     <w:rPrDefault>
       <w:rPr>
-        <w:rFonts w:asciiTheme="minorHAnsi" w:hAnsiTheme="minorHAnsi" w:eastAsiaTheme="minorHAnsi" w:cstheme="minorBidi"/>
+        <w:rFonts w:ascii="Aptos" w:hAnsi="Aptos" w:eastAsia="Aptos" w:cs="" w:asciiTheme="minorHAnsi" w:cstheme="minorBidi" w:eastAsiaTheme="minorHAnsi" w:hAnsiTheme="minorHAnsi"/>
         <w:sz w:val="24"/>
         <w:szCs w:val="24"/>
         <w:lang w:val="ru-RU" w:eastAsia="en-US" w:bidi="ar-SA"/>
@@ -385,7 +620,7 @@
     </w:rPrDefault>
     <w:pPrDefault>
       <w:pPr>
-        <w:spacing w:after="160" w:line="279" w:lineRule="auto"/>
+        <w:suppressAutoHyphens w:val="true"/>
       </w:pPr>
     </w:pPrDefault>
   </w:docDefaults>
@@ -765,20 +1000,96 @@
   <w:style w:type="paragraph" w:styleId="Normal" w:default="1">
     <w:name w:val="Normal"/>
     <w:qFormat/>
+    <w:pPr>
+      <w:widowControl/>
+      <w:suppressAutoHyphens w:val="true"/>
+      <w:bidi w:val="0"/>
+      <w:spacing w:lineRule="auto" w:line="278" w:before="0" w:after="160"/>
+      <w:jc w:val="start"/>
+    </w:pPr>
+    <w:rPr>
+      <w:rFonts w:ascii="Aptos" w:hAnsi="Aptos" w:eastAsia="Aptos" w:cs="" w:asciiTheme="minorHAnsi" w:cstheme="minorBidi" w:eastAsiaTheme="minorHAnsi" w:hAnsiTheme="minorHAnsi"/>
+      <w:color w:val="auto"/>
+      <w:kern w:val="0"/>
+      <w:sz w:val="24"/>
+      <w:szCs w:val="24"/>
+      <w:lang w:val="ru-RU" w:eastAsia="en-US" w:bidi="ar-SA"/>
+    </w:rPr>
   </w:style>
   <w:style w:type="character" w:styleId="DefaultParagraphFont" w:default="1">
     <w:name w:val="Default Paragraph Font"/>
     <w:uiPriority w:val="1"/>
     <w:semiHidden/>
     <w:unhideWhenUsed/>
+    <w:qFormat/>
+    <w:rPr/>
   </w:style>
-  <w:style w:type="table" w:styleId="TableNormal" w:default="1">
+  <w:style w:type="paragraph" w:styleId="Heading">
+    <w:name w:val="Heading"/>
+    <w:basedOn w:val="Normal"/>
+    <w:next w:val="BodyText"/>
+    <w:qFormat/>
+    <w:pPr>
+      <w:keepNext w:val="true"/>
+      <w:spacing w:before="240" w:after="120"/>
+    </w:pPr>
+    <w:rPr>
+      <w:rFonts w:ascii="Liberation Sans" w:hAnsi="Liberation Sans" w:eastAsia="FreeSans" w:cs="FreeSans"/>
+      <w:sz w:val="28"/>
+      <w:szCs w:val="28"/>
+    </w:rPr>
+  </w:style>
+  <w:style w:type="paragraph" w:styleId="BodyText">
+    <w:name w:val="Body Text"/>
+    <w:basedOn w:val="Normal"/>
+    <w:pPr>
+      <w:spacing w:lineRule="auto" w:line="276" w:before="0" w:after="140"/>
+    </w:pPr>
+    <w:rPr/>
+  </w:style>
+  <w:style w:type="paragraph" w:styleId="List">
+    <w:name w:val="List"/>
+    <w:basedOn w:val="BodyText"/>
+    <w:pPr/>
+    <w:rPr/>
+  </w:style>
+  <w:style w:type="paragraph" w:styleId="Caption">
+    <w:name w:val="caption"/>
+    <w:basedOn w:val="Normal"/>
+    <w:qFormat/>
+    <w:pPr>
+      <w:suppressLineNumbers/>
+      <w:spacing w:before="120" w:after="120"/>
+    </w:pPr>
+    <w:rPr>
+      <w:i/>
+      <w:iCs/>
+      <w:sz w:val="24"/>
+      <w:szCs w:val="24"/>
+    </w:rPr>
+  </w:style>
+  <w:style w:type="paragraph" w:styleId="Index">
+    <w:name w:val="Index"/>
+    <w:basedOn w:val="Normal"/>
+    <w:qFormat/>
+    <w:pPr>
+      <w:suppressLineNumbers/>
+    </w:pPr>
+    <w:rPr/>
+  </w:style>
+  <w:style w:type="numbering" w:styleId="NoList" w:default="1">
+    <w:name w:val="No List"/>
+    <w:uiPriority w:val="99"/>
+    <w:semiHidden/>
+    <w:unhideWhenUsed/>
+    <w:qFormat/>
+  </w:style>
+  <w:style w:type="table" w:default="1" w:styleId="TableNormal">
     <w:name w:val="Normal Table"/>
     <w:uiPriority w:val="99"/>
     <w:semiHidden/>
     <w:unhideWhenUsed/>
     <w:tblPr>
-      <w:tblInd w:w="0" w:type="dxa"/>
       <w:tblCellMar>
         <w:top w:w="0" w:type="dxa"/>
         <w:left w:w="108" w:type="dxa"/>
@@ -787,22 +1098,15 @@
       </w:tblCellMar>
     </w:tblPr>
   </w:style>
-  <w:style w:type="numbering" w:styleId="NoList" w:default="1">
-    <w:name w:val="No List"/>
-    <w:uiPriority w:val="99"/>
-    <w:semiHidden/>
-    <w:unhideWhenUsed/>
-  </w:style>
-  <w:style xmlns:w="http://schemas.openxmlformats.org/wordprocessingml/2006/main" w:type="table" w:styleId="TableGrid">
-    <w:name xmlns:w="http://schemas.openxmlformats.org/wordprocessingml/2006/main" w:val="Table Grid"/>
-    <w:basedOn xmlns:w="http://schemas.openxmlformats.org/wordprocessingml/2006/main" w:val="TableNormal"/>
-    <w:uiPriority xmlns:w="http://schemas.openxmlformats.org/wordprocessingml/2006/main" w:val="59"/>
-    <w:rsid xmlns:w="http://schemas.openxmlformats.org/wordprocessingml/2006/main" w:val="00FB4123"/>
-    <w:pPr xmlns:w="http://schemas.openxmlformats.org/wordprocessingml/2006/main">
+  <w:style w:type="table" w:styleId="TableGrid">
+    <w:name w:val="Table Grid"/>
+    <w:basedOn w:val="TableNormal"/>
+    <w:uiPriority w:val="59"/>
+    <w:rsid w:val="00fb4123"/>
+    <w:pPr>
       <w:spacing w:after="0" w:line="240" w:lineRule="auto"/>
     </w:pPr>
-    <w:tblPr xmlns:w="http://schemas.openxmlformats.org/wordprocessingml/2006/main">
-      <w:tblInd w:w="0" w:type="dxa"/>
+    <w:tblPr>
       <w:tblBorders>
         <w:top w:val="single" w:color="000000" w:themeColor="text1" w:sz="4" w:space="0"/>
         <w:left w:val="single" w:color="000000" w:themeColor="text1" w:sz="4" w:space="0"/>
@@ -823,14 +1127,14 @@
 </file>
 
 <file path=word/theme/theme1.xml><?xml version="1.0" encoding="utf-8"?>
-<a:theme xmlns:thm15="http://schemas.microsoft.com/office/thememl/2012/main" xmlns:a="http://schemas.openxmlformats.org/drawingml/2006/main" name="Office Theme">
+<a:theme xmlns:a="http://schemas.openxmlformats.org/drawingml/2006/main" xmlns:r="http://schemas.openxmlformats.org/officeDocument/2006/relationships" name="Office Theme">
   <a:themeElements>
     <a:clrScheme name="Office">
       <a:dk1>
-        <a:sysClr val="windowText" lastClr="000000"/>
+        <a:srgbClr val="000000"/>
       </a:dk1>
       <a:lt1>
-        <a:sysClr val="window" lastClr="FFFFFF"/>
+        <a:srgbClr val="FFFFFF"/>
       </a:lt1>
       <a:dk2>
         <a:srgbClr val="0E2841"/>
@@ -865,119 +1169,55 @@
     </a:clrScheme>
     <a:fontScheme name="Office">
       <a:majorFont>
-        <a:latin typeface="Aptos Display" panose="02110004020202020204"/>
+        <a:latin typeface="Aptos Display" panose="02110004020202020204" pitchFamily="0" charset="1"/>
         <a:ea typeface=""/>
         <a:cs typeface=""/>
-        <a:font script="Jpan" typeface="ＭＳ ゴシック"/>
-        <a:font script="Hang" typeface="맑은 고딕"/>
-        <a:font script="Hans" typeface="宋体"/>
-        <a:font script="Hant" typeface="新細明體"/>
-        <a:font script="Arab" typeface="Times New Roman"/>
-        <a:font script="Hebr" typeface="Times New Roman"/>
-        <a:font script="Thai" typeface="Angsana New"/>
-        <a:font script="Ethi" typeface="Nyala"/>
-        <a:font script="Beng" typeface="Vrinda"/>
-        <a:font script="Gujr" typeface="Shruti"/>
-        <a:font script="Khmr" typeface="MoolBoran"/>
-        <a:font script="Knda" typeface="Tunga"/>
-        <a:font script="Guru" typeface="Raavi"/>
-        <a:font script="Cans" typeface="Euphemia"/>
-        <a:font script="Cher" typeface="Plantagenet Cherokee"/>
-        <a:font script="Yiii" typeface="Microsoft Yi Baiti"/>
-        <a:font script="Tibt" typeface="Microsoft Himalaya"/>
-        <a:font script="Thaa" typeface="MV Boli"/>
-        <a:font script="Deva" typeface="Mangal"/>
-        <a:font script="Telu" typeface="Gautami"/>
-        <a:font script="Taml" typeface="Latha"/>
-        <a:font script="Syrc" typeface="Estrangelo Edessa"/>
-        <a:font script="Orya" typeface="Kalinga"/>
-        <a:font script="Mlym" typeface="Kartika"/>
-        <a:font script="Laoo" typeface="DokChampa"/>
-        <a:font script="Sinh" typeface="Iskoola Pota"/>
-        <a:font script="Mong" typeface="Mongolian Baiti"/>
-        <a:font script="Viet" typeface="Times New Roman"/>
-        <a:font script="Uigh" typeface="Microsoft Uighur"/>
-        <a:font script="Geor" typeface="Sylfaen"/>
       </a:majorFont>
       <a:minorFont>
-        <a:latin typeface="Aptos" panose="02110004020202020204"/>
+        <a:latin typeface="Aptos" panose="02110004020202020204" pitchFamily="0" charset="1"/>
         <a:ea typeface=""/>
         <a:cs typeface=""/>
-        <a:font script="Jpan" typeface="ＭＳ 明朝"/>
-        <a:font script="Hang" typeface="맑은 고딕"/>
-        <a:font script="Hans" typeface="宋体"/>
-        <a:font script="Hant" typeface="新細明體"/>
-        <a:font script="Arab" typeface="Arial"/>
-        <a:font script="Hebr" typeface="Arial"/>
-        <a:font script="Thai" typeface="Cordia New"/>
-        <a:font script="Ethi" typeface="Nyala"/>
-        <a:font script="Beng" typeface="Vrinda"/>
-        <a:font script="Gujr" typeface="Shruti"/>
-        <a:font script="Khmr" typeface="DaunPenh"/>
-        <a:font script="Knda" typeface="Tunga"/>
-        <a:font script="Guru" typeface="Raavi"/>
-        <a:font script="Cans" typeface="Euphemia"/>
-        <a:font script="Cher" typeface="Plantagenet Cherokee"/>
-        <a:font script="Yiii" typeface="Microsoft Yi Baiti"/>
-        <a:font script="Tibt" typeface="Microsoft Himalaya"/>
-        <a:font script="Thaa" typeface="MV Boli"/>
-        <a:font script="Deva" typeface="Mangal"/>
-        <a:font script="Telu" typeface="Gautami"/>
-        <a:font script="Taml" typeface="Latha"/>
-        <a:font script="Syrc" typeface="Estrangelo Edessa"/>
-        <a:font script="Orya" typeface="Kalinga"/>
-        <a:font script="Mlym" typeface="Kartika"/>
-        <a:font script="Laoo" typeface="DokChampa"/>
-        <a:font script="Sinh" typeface="Iskoola Pota"/>
-        <a:font script="Mong" typeface="Mongolian Baiti"/>
-        <a:font script="Viet" typeface="Arial"/>
-        <a:font script="Uigh" typeface="Microsoft Uighur"/>
-        <a:font script="Geor" typeface="Sylfaen"/>
       </a:minorFont>
     </a:fontScheme>
-    <a:fmtScheme name="Office">
+    <a:fmtScheme>
       <a:fillStyleLst>
         <a:solidFill>
           <a:schemeClr val="phClr"/>
         </a:solidFill>
-        <a:gradFill rotWithShape="1">
+        <a:gradFill>
           <a:gsLst>
             <a:gs pos="0">
               <a:schemeClr val="phClr">
                 <a:lumMod val="110000"/>
-                <a:satMod val="105000"/>
                 <a:tint val="67000"/>
               </a:schemeClr>
             </a:gs>
             <a:gs pos="50000">
               <a:schemeClr val="phClr">
                 <a:lumMod val="105000"/>
-                <a:satMod val="103000"/>
                 <a:tint val="73000"/>
               </a:schemeClr>
             </a:gs>
             <a:gs pos="100000">
               <a:schemeClr val="phClr">
                 <a:lumMod val="105000"/>
-                <a:satMod val="109000"/>
                 <a:tint val="81000"/>
               </a:schemeClr>
             </a:gs>
           </a:gsLst>
           <a:lin ang="5400000" scaled="0"/>
+          <a:tileRect l="0" t="0" r="0" b="0"/>
         </a:gradFill>
-        <a:gradFill rotWithShape="1">
+        <a:gradFill>
           <a:gsLst>
             <a:gs pos="0">
               <a:schemeClr val="phClr">
-                <a:satMod val="103000"/>
                 <a:lumMod val="102000"/>
                 <a:tint val="94000"/>
               </a:schemeClr>
             </a:gs>
             <a:gs pos="50000">
               <a:schemeClr val="phClr">
-                <a:satMod val="110000"/>
                 <a:lumMod val="100000"/>
                 <a:shade val="100000"/>
               </a:schemeClr>
@@ -985,33 +1225,24 @@
             <a:gs pos="100000">
               <a:schemeClr val="phClr">
                 <a:lumMod val="99000"/>
-                <a:satMod val="120000"/>
                 <a:shade val="78000"/>
               </a:schemeClr>
             </a:gs>
           </a:gsLst>
           <a:lin ang="5400000" scaled="0"/>
+          <a:tileRect l="0" t="0" r="0" b="0"/>
         </a:gradFill>
       </a:fillStyleLst>
       <a:lnStyleLst>
         <a:ln w="6350" cap="flat" cmpd="sng" algn="ctr">
-          <a:solidFill>
-            <a:schemeClr val="phClr"/>
-          </a:solidFill>
           <a:prstDash val="solid"/>
           <a:miter lim="800000"/>
         </a:ln>
         <a:ln w="12700" cap="flat" cmpd="sng" algn="ctr">
-          <a:solidFill>
-            <a:schemeClr val="phClr"/>
-          </a:solidFill>
           <a:prstDash val="solid"/>
           <a:miter lim="800000"/>
         </a:ln>
         <a:ln w="19050" cap="flat" cmpd="sng" algn="ctr">
-          <a:solidFill>
-            <a:schemeClr val="phClr"/>
-          </a:solidFill>
           <a:prstDash val="solid"/>
           <a:miter lim="800000"/>
         </a:ln>
@@ -1024,13 +1255,7 @@
           <a:effectLst/>
         </a:effectStyle>
         <a:effectStyle>
-          <a:effectLst>
-            <a:outerShdw blurRad="57150" dist="19050" dir="5400000" algn="ctr" rotWithShape="0">
-              <a:srgbClr val="000000">
-                <a:alpha val="63000"/>
-              </a:srgbClr>
-            </a:outerShdw>
-          </a:effectLst>
+          <a:effectLst/>
         </a:effectStyle>
       </a:effectStyleLst>
       <a:bgFillStyleLst>
@@ -1040,15 +1265,13 @@
         <a:solidFill>
           <a:schemeClr val="phClr">
             <a:tint val="95000"/>
-            <a:satMod val="170000"/>
           </a:schemeClr>
         </a:solidFill>
-        <a:gradFill rotWithShape="1">
+        <a:gradFill>
           <a:gsLst>
             <a:gs pos="0">
               <a:schemeClr val="phClr">
                 <a:tint val="93000"/>
-                <a:satMod val="150000"/>
                 <a:shade val="98000"/>
                 <a:lumMod val="102000"/>
               </a:schemeClr>
@@ -1056,7 +1279,6 @@
             <a:gs pos="50000">
               <a:schemeClr val="phClr">
                 <a:tint val="98000"/>
-                <a:satMod val="130000"/>
                 <a:shade val="90000"/>
                 <a:lumMod val="103000"/>
               </a:schemeClr>
@@ -1064,21 +1286,14 @@
             <a:gs pos="100000">
               <a:schemeClr val="phClr">
                 <a:shade val="63000"/>
-                <a:satMod val="120000"/>
               </a:schemeClr>
             </a:gs>
           </a:gsLst>
           <a:lin ang="5400000" scaled="0"/>
+          <a:tileRect l="0" t="0" r="0" b="0"/>
         </a:gradFill>
       </a:bgFillStyleLst>
     </a:fmtScheme>
   </a:themeElements>
-  <a:objectDefaults/>
-  <a:extraClrSchemeLst/>
-  <a:extLst>
-    <a:ext uri="{05A4C25C-085E-4340-85A3-A5531E510DB2}">
-      <thm15:themeFamily xmlns:thm15="http://schemas.microsoft.com/office/thememl/2012/main" name="Office Theme" id="{62F939B6-93AF-4DB8-9C6B-D6C7DFDC589F}" vid="{4A3C46E8-61CC-4603-A589-7422A47A8E4A}"/>
-    </a:ext>
-  </a:extLst>
 </a:theme>
 </file>
</xml_diff>